<commit_message>
feat: add new evaluation tasks and update assets for LibreOffice, Inkscape, Kdenlive, Blender domains
- Add 30+ new task JSONs for libreoffice_impr_njc, libreoffice_calc_njc, libreoffice_writ_njc, kdenlive, blender, inkscape
- Add backup_json directory and example_final task configs
- Update LibreOffice Calc/Impress/Writer asset files (.xlsx, .pptx, .docx)
- Add libreoffice_suite_njc task examples and windows evaluator config
- Update taiji_task scripts (r3agentv3, interactive, vllm)
- Add test scripts: test_thinking_mode.py, test_user_model.py, check_task_coverage.py
- Remove deprecated evaluation list JSONs (gimp_new, inkscape_all, kdenlive_all, etc.)
- Update example_final_interactive_all and example_final_non_interactive_all task lists

Co-Authored-By: Claude Sonnet 4.6 (1M context) <noreply@anthropic.com>
</commit_message>
<xml_diff>
--- a/assets/libreoffice_writ_njc/1cd80191-f69d-4d57-9197-e10d0c8fbbce/Policy_L2_04.docx
+++ b/assets/libreoffice_writ_njc/1cd80191-f69d-4d57-9197-e10d0c8fbbce/Policy_L2_04.docx
@@ -5,110 +5,176 @@
     <w:p>
       <w:pPr>
         <w:pStyle w:val="Title"/>
-        <w:rPr/>
+        <w:rPr>
+          <w:sz w:val="24"/>
+          <w:szCs w:val="24"/>
+        </w:rPr>
       </w:pPr>
       <w:r>
-        <w:rPr/>
+        <w:rPr>
+          <w:sz w:val="24"/>
+          <w:szCs w:val="24"/>
+        </w:rPr>
         <w:t>Company Remote Work Policy</w:t>
       </w:r>
     </w:p>
     <w:p>
       <w:pPr>
         <w:pStyle w:val="Normal"/>
-        <w:rPr/>
+        <w:rPr>
+          <w:sz w:val="24"/>
+          <w:szCs w:val="24"/>
+        </w:rPr>
       </w:pPr>
       <w:r>
-        <w:rPr/>
+        <w:rPr>
+          <w:sz w:val="24"/>
+          <w:szCs w:val="24"/>
+        </w:rPr>
         <w:t>Effective Date: January 1, 2025 | Version 3.0</w:t>
       </w:r>
     </w:p>
     <w:p>
       <w:pPr>
         <w:pStyle w:val="Heading1"/>
-        <w:rPr/>
+        <w:rPr>
+          <w:sz w:val="24"/>
+          <w:szCs w:val="24"/>
+        </w:rPr>
       </w:pPr>
       <w:r>
-        <w:rPr/>
+        <w:rPr>
+          <w:sz w:val="24"/>
+          <w:szCs w:val="24"/>
+        </w:rPr>
         <w:t>1. Purpose</w:t>
       </w:r>
     </w:p>
     <w:p>
       <w:pPr>
         <w:pStyle w:val="Normal"/>
-        <w:rPr/>
+        <w:rPr>
+          <w:sz w:val="24"/>
+          <w:szCs w:val="24"/>
+        </w:rPr>
       </w:pPr>
       <w:r>
-        <w:rPr/>
+        <w:rPr>
+          <w:sz w:val="24"/>
+          <w:szCs w:val="24"/>
+        </w:rPr>
         <w:t>This policy establishes guidelines for remote work arrangements to ensure productivity, collaboration, and work-life balance while maintaining the company's operational standards.</w:t>
       </w:r>
     </w:p>
     <w:p>
       <w:pPr>
         <w:pStyle w:val="Heading1"/>
-        <w:rPr/>
+        <w:rPr>
+          <w:sz w:val="24"/>
+          <w:szCs w:val="24"/>
+        </w:rPr>
       </w:pPr>
       <w:r>
-        <w:rPr/>
+        <w:rPr>
+          <w:sz w:val="24"/>
+          <w:szCs w:val="24"/>
+        </w:rPr>
         <w:t>2. Eligibility</w:t>
       </w:r>
     </w:p>
     <w:p>
       <w:pPr>
         <w:pStyle w:val="Normal"/>
-        <w:rPr/>
+        <w:rPr>
+          <w:sz w:val="24"/>
+          <w:szCs w:val="24"/>
+        </w:rPr>
       </w:pPr>
       <w:r>
-        <w:rPr/>
+        <w:rPr>
+          <w:sz w:val="24"/>
+          <w:szCs w:val="24"/>
+        </w:rPr>
         <w:t>All full-time employees who have completed their probation period (90 days) are eligible for remote work arrangements. Approval is subject to manager discretion and role requirements.</w:t>
       </w:r>
     </w:p>
     <w:p>
       <w:pPr>
         <w:pStyle w:val="Heading1"/>
-        <w:rPr/>
+        <w:rPr>
+          <w:sz w:val="24"/>
+          <w:szCs w:val="24"/>
+        </w:rPr>
       </w:pPr>
       <w:r>
-        <w:rPr/>
+        <w:rPr>
+          <w:sz w:val="24"/>
+          <w:szCs w:val="24"/>
+        </w:rPr>
         <w:t>3. Work Schedule</w:t>
       </w:r>
     </w:p>
     <w:p>
       <w:pPr>
         <w:pStyle w:val="Normal"/>
-        <w:rPr/>
+        <w:rPr>
+          <w:sz w:val="24"/>
+          <w:szCs w:val="24"/>
+        </w:rPr>
       </w:pPr>
       <w:r>
-        <w:rPr/>
+        <w:rPr>
+          <w:sz w:val="24"/>
+          <w:szCs w:val="24"/>
+        </w:rPr>
         <w:t>Remote employees must maintain core hours of 10:00 AM to 3:00 PM in their local time zone. Flexible hours outside of core hours are permitted with manager approval. Total weekly hours should not exceed 45 hours without prior authorization.</w:t>
       </w:r>
     </w:p>
     <w:p>
       <w:pPr>
         <w:pStyle w:val="Heading1"/>
-        <w:rPr/>
+        <w:rPr>
+          <w:sz w:val="24"/>
+          <w:szCs w:val="24"/>
+        </w:rPr>
       </w:pPr>
       <w:r>
-        <w:rPr/>
+        <w:rPr>
+          <w:sz w:val="24"/>
+          <w:szCs w:val="24"/>
+        </w:rPr>
         <w:t>4. Equipment and Security</w:t>
       </w:r>
     </w:p>
     <w:p>
       <w:pPr>
         <w:pStyle w:val="Normal"/>
-        <w:rPr/>
+        <w:rPr>
+          <w:sz w:val="24"/>
+          <w:szCs w:val="24"/>
+        </w:rPr>
       </w:pPr>
       <w:r>
-        <w:rPr/>
+        <w:rPr>
+          <w:sz w:val="24"/>
+          <w:szCs w:val="24"/>
+        </w:rPr>
         <w:t>The company will provide a laptop, monitor, and necessary peripherals. Employees must use the company VPN for all work-related activities. Personal devices may not be used to access company data without IT department approval.</w:t>
       </w:r>
     </w:p>
     <w:p>
       <w:pPr>
         <w:pStyle w:val="Heading1"/>
-        <w:rPr/>
+        <w:rPr>
+          <w:sz w:val="24"/>
+          <w:szCs w:val="24"/>
+        </w:rPr>
       </w:pPr>
       <w:r>
-        <w:rPr/>
+        <w:rPr>
+          <w:sz w:val="24"/>
+          <w:szCs w:val="24"/>
+        </w:rPr>
         <w:t>5. Communication Standards</w:t>
       </w:r>
     </w:p>
@@ -119,12 +185,17 @@
         <w:bidi w:val="0"/>
         <w:spacing w:lineRule="auto" w:line="276" w:before="0" w:after="200"/>
         <w:jc w:val="left"/>
-        <w:rPr/>
+        <w:rPr>
+          <w:sz w:val="24"/>
+          <w:szCs w:val="24"/>
+        </w:rPr>
       </w:pPr>
       <w:r>
         <w:rPr>
           <w:i/>
           <w:iCs/>
+          <w:sz w:val="24"/>
+          <w:szCs w:val="24"/>
         </w:rPr>
         <w:t>Employees must be reachable via Slack during core hours and respond to messages within 30 minutes. Video musll scheduled meetings. Weekly one-on-ont be enabled for ae meetings with direct managers are mandatory.</w:t>
       </w:r>
@@ -171,6 +242,7 @@
         </w:tabs>
         <w:ind w:left="1080" w:hanging="360"/>
       </w:pPr>
+      <w:rPr/>
     </w:lvl>
     <w:lvl w:ilvl="2">
       <w:start w:val="1"/>
@@ -183,6 +255,7 @@
         </w:tabs>
         <w:ind w:left="1440" w:hanging="360"/>
       </w:pPr>
+      <w:rPr/>
     </w:lvl>
     <w:lvl w:ilvl="3">
       <w:start w:val="1"/>
@@ -195,6 +268,7 @@
         </w:tabs>
         <w:ind w:left="1800" w:hanging="360"/>
       </w:pPr>
+      <w:rPr/>
     </w:lvl>
     <w:lvl w:ilvl="4">
       <w:start w:val="1"/>
@@ -207,6 +281,7 @@
         </w:tabs>
         <w:ind w:left="2160" w:hanging="360"/>
       </w:pPr>
+      <w:rPr/>
     </w:lvl>
     <w:lvl w:ilvl="5">
       <w:start w:val="1"/>
@@ -219,6 +294,7 @@
         </w:tabs>
         <w:ind w:left="2520" w:hanging="360"/>
       </w:pPr>
+      <w:rPr/>
     </w:lvl>
     <w:lvl w:ilvl="6">
       <w:start w:val="1"/>
@@ -231,6 +307,7 @@
         </w:tabs>
         <w:ind w:left="2880" w:hanging="360"/>
       </w:pPr>
+      <w:rPr/>
     </w:lvl>
     <w:lvl w:ilvl="7">
       <w:start w:val="1"/>
@@ -243,6 +320,7 @@
         </w:tabs>
         <w:ind w:left="3240" w:hanging="360"/>
       </w:pPr>
+      <w:rPr/>
     </w:lvl>
     <w:lvl w:ilvl="8">
       <w:start w:val="1"/>
@@ -255,6 +333,7 @@
         </w:tabs>
         <w:ind w:left="3600" w:hanging="360"/>
       </w:pPr>
+      <w:rPr/>
     </w:lvl>
   </w:abstractNum>
   <w:abstractNum w:abstractNumId="2">
@@ -284,6 +363,7 @@
         </w:tabs>
         <w:ind w:left="1080" w:hanging="360"/>
       </w:pPr>
+      <w:rPr/>
     </w:lvl>
     <w:lvl w:ilvl="2">
       <w:start w:val="1"/>
@@ -296,6 +376,7 @@
         </w:tabs>
         <w:ind w:left="1440" w:hanging="360"/>
       </w:pPr>
+      <w:rPr/>
     </w:lvl>
     <w:lvl w:ilvl="3">
       <w:start w:val="1"/>
@@ -308,6 +389,7 @@
         </w:tabs>
         <w:ind w:left="1800" w:hanging="360"/>
       </w:pPr>
+      <w:rPr/>
     </w:lvl>
     <w:lvl w:ilvl="4">
       <w:start w:val="1"/>
@@ -320,6 +402,7 @@
         </w:tabs>
         <w:ind w:left="2160" w:hanging="360"/>
       </w:pPr>
+      <w:rPr/>
     </w:lvl>
     <w:lvl w:ilvl="5">
       <w:start w:val="1"/>
@@ -332,6 +415,7 @@
         </w:tabs>
         <w:ind w:left="2520" w:hanging="360"/>
       </w:pPr>
+      <w:rPr/>
     </w:lvl>
     <w:lvl w:ilvl="6">
       <w:start w:val="1"/>
@@ -344,6 +428,7 @@
         </w:tabs>
         <w:ind w:left="2880" w:hanging="360"/>
       </w:pPr>
+      <w:rPr/>
     </w:lvl>
     <w:lvl w:ilvl="7">
       <w:start w:val="1"/>
@@ -356,6 +441,7 @@
         </w:tabs>
         <w:ind w:left="3240" w:hanging="360"/>
       </w:pPr>
+      <w:rPr/>
     </w:lvl>
     <w:lvl w:ilvl="8">
       <w:start w:val="1"/>
@@ -368,6 +454,7 @@
         </w:tabs>
         <w:ind w:left="3600" w:hanging="360"/>
       </w:pPr>
+      <w:rPr/>
     </w:lvl>
   </w:abstractNum>
   <w:abstractNum w:abstractNumId="3">
@@ -397,6 +484,7 @@
         </w:tabs>
         <w:ind w:left="1080" w:hanging="360"/>
       </w:pPr>
+      <w:rPr/>
     </w:lvl>
     <w:lvl w:ilvl="2">
       <w:start w:val="1"/>
@@ -409,6 +497,7 @@
         </w:tabs>
         <w:ind w:left="1440" w:hanging="360"/>
       </w:pPr>
+      <w:rPr/>
     </w:lvl>
     <w:lvl w:ilvl="3">
       <w:start w:val="1"/>
@@ -421,6 +510,7 @@
         </w:tabs>
         <w:ind w:left="1800" w:hanging="360"/>
       </w:pPr>
+      <w:rPr/>
     </w:lvl>
     <w:lvl w:ilvl="4">
       <w:start w:val="1"/>
@@ -433,6 +523,7 @@
         </w:tabs>
         <w:ind w:left="2160" w:hanging="360"/>
       </w:pPr>
+      <w:rPr/>
     </w:lvl>
     <w:lvl w:ilvl="5">
       <w:start w:val="1"/>
@@ -445,6 +536,7 @@
         </w:tabs>
         <w:ind w:left="2520" w:hanging="360"/>
       </w:pPr>
+      <w:rPr/>
     </w:lvl>
     <w:lvl w:ilvl="6">
       <w:start w:val="1"/>
@@ -457,6 +549,7 @@
         </w:tabs>
         <w:ind w:left="2880" w:hanging="360"/>
       </w:pPr>
+      <w:rPr/>
     </w:lvl>
     <w:lvl w:ilvl="7">
       <w:start w:val="1"/>
@@ -469,6 +562,7 @@
         </w:tabs>
         <w:ind w:left="3240" w:hanging="360"/>
       </w:pPr>
+      <w:rPr/>
     </w:lvl>
     <w:lvl w:ilvl="8">
       <w:start w:val="1"/>
@@ -481,6 +575,7 @@
         </w:tabs>
         <w:ind w:left="3600" w:hanging="360"/>
       </w:pPr>
+      <w:rPr/>
     </w:lvl>
   </w:abstractNum>
   <w:abstractNum w:abstractNumId="4">
@@ -508,6 +603,7 @@
         </w:tabs>
         <w:ind w:left="1080" w:hanging="360"/>
       </w:pPr>
+      <w:rPr/>
     </w:lvl>
     <w:lvl w:ilvl="2">
       <w:start w:val="1"/>
@@ -520,6 +616,7 @@
         </w:tabs>
         <w:ind w:left="1440" w:hanging="360"/>
       </w:pPr>
+      <w:rPr/>
     </w:lvl>
     <w:lvl w:ilvl="3">
       <w:start w:val="1"/>
@@ -532,6 +629,7 @@
         </w:tabs>
         <w:ind w:left="1800" w:hanging="360"/>
       </w:pPr>
+      <w:rPr/>
     </w:lvl>
     <w:lvl w:ilvl="4">
       <w:start w:val="1"/>
@@ -544,6 +642,7 @@
         </w:tabs>
         <w:ind w:left="2160" w:hanging="360"/>
       </w:pPr>
+      <w:rPr/>
     </w:lvl>
     <w:lvl w:ilvl="5">
       <w:start w:val="1"/>
@@ -556,6 +655,7 @@
         </w:tabs>
         <w:ind w:left="2520" w:hanging="360"/>
       </w:pPr>
+      <w:rPr/>
     </w:lvl>
     <w:lvl w:ilvl="6">
       <w:start w:val="1"/>
@@ -568,6 +668,7 @@
         </w:tabs>
         <w:ind w:left="2880" w:hanging="360"/>
       </w:pPr>
+      <w:rPr/>
     </w:lvl>
     <w:lvl w:ilvl="7">
       <w:start w:val="1"/>
@@ -580,6 +681,7 @@
         </w:tabs>
         <w:ind w:left="3240" w:hanging="360"/>
       </w:pPr>
+      <w:rPr/>
     </w:lvl>
     <w:lvl w:ilvl="8">
       <w:start w:val="1"/>
@@ -592,6 +694,7 @@
         </w:tabs>
         <w:ind w:left="3600" w:hanging="360"/>
       </w:pPr>
+      <w:rPr/>
     </w:lvl>
   </w:abstractNum>
   <w:abstractNum w:abstractNumId="5">
@@ -619,6 +722,7 @@
         </w:tabs>
         <w:ind w:left="1080" w:hanging="360"/>
       </w:pPr>
+      <w:rPr/>
     </w:lvl>
     <w:lvl w:ilvl="2">
       <w:start w:val="1"/>
@@ -631,6 +735,7 @@
         </w:tabs>
         <w:ind w:left="1440" w:hanging="360"/>
       </w:pPr>
+      <w:rPr/>
     </w:lvl>
     <w:lvl w:ilvl="3">
       <w:start w:val="1"/>
@@ -643,6 +748,7 @@
         </w:tabs>
         <w:ind w:left="1800" w:hanging="360"/>
       </w:pPr>
+      <w:rPr/>
     </w:lvl>
     <w:lvl w:ilvl="4">
       <w:start w:val="1"/>
@@ -655,6 +761,7 @@
         </w:tabs>
         <w:ind w:left="2160" w:hanging="360"/>
       </w:pPr>
+      <w:rPr/>
     </w:lvl>
     <w:lvl w:ilvl="5">
       <w:start w:val="1"/>
@@ -667,6 +774,7 @@
         </w:tabs>
         <w:ind w:left="2520" w:hanging="360"/>
       </w:pPr>
+      <w:rPr/>
     </w:lvl>
     <w:lvl w:ilvl="6">
       <w:start w:val="1"/>
@@ -679,6 +787,7 @@
         </w:tabs>
         <w:ind w:left="2880" w:hanging="360"/>
       </w:pPr>
+      <w:rPr/>
     </w:lvl>
     <w:lvl w:ilvl="7">
       <w:start w:val="1"/>
@@ -691,6 +800,7 @@
         </w:tabs>
         <w:ind w:left="3240" w:hanging="360"/>
       </w:pPr>
+      <w:rPr/>
     </w:lvl>
     <w:lvl w:ilvl="8">
       <w:start w:val="1"/>
@@ -703,6 +813,7 @@
         </w:tabs>
         <w:ind w:left="3600" w:hanging="360"/>
       </w:pPr>
+      <w:rPr/>
     </w:lvl>
   </w:abstractNum>
   <w:abstractNum w:abstractNumId="6">
@@ -730,6 +841,7 @@
         </w:tabs>
         <w:ind w:left="1080" w:hanging="360"/>
       </w:pPr>
+      <w:rPr/>
     </w:lvl>
     <w:lvl w:ilvl="2">
       <w:start w:val="1"/>
@@ -742,6 +854,7 @@
         </w:tabs>
         <w:ind w:left="1440" w:hanging="360"/>
       </w:pPr>
+      <w:rPr/>
     </w:lvl>
     <w:lvl w:ilvl="3">
       <w:start w:val="1"/>
@@ -754,6 +867,7 @@
         </w:tabs>
         <w:ind w:left="1800" w:hanging="360"/>
       </w:pPr>
+      <w:rPr/>
     </w:lvl>
     <w:lvl w:ilvl="4">
       <w:start w:val="1"/>
@@ -766,6 +880,7 @@
         </w:tabs>
         <w:ind w:left="2160" w:hanging="360"/>
       </w:pPr>
+      <w:rPr/>
     </w:lvl>
     <w:lvl w:ilvl="5">
       <w:start w:val="1"/>
@@ -778,6 +893,7 @@
         </w:tabs>
         <w:ind w:left="2520" w:hanging="360"/>
       </w:pPr>
+      <w:rPr/>
     </w:lvl>
     <w:lvl w:ilvl="6">
       <w:start w:val="1"/>
@@ -790,6 +906,7 @@
         </w:tabs>
         <w:ind w:left="2880" w:hanging="360"/>
       </w:pPr>
+      <w:rPr/>
     </w:lvl>
     <w:lvl w:ilvl="7">
       <w:start w:val="1"/>
@@ -802,6 +919,7 @@
         </w:tabs>
         <w:ind w:left="3240" w:hanging="360"/>
       </w:pPr>
+      <w:rPr/>
     </w:lvl>
     <w:lvl w:ilvl="8">
       <w:start w:val="1"/>
@@ -814,6 +932,7 @@
         </w:tabs>
         <w:ind w:left="3600" w:hanging="360"/>
       </w:pPr>
+      <w:rPr/>
     </w:lvl>
   </w:abstractNum>
   <w:abstractNum w:abstractNumId="7">
@@ -1121,6 +1240,7 @@
     <w:rsid w:val="00fc693f"/>
     <w:pPr>
       <w:widowControl/>
+      <w:suppressAutoHyphens w:val="true"/>
       <w:bidi w:val="0"/>
       <w:spacing w:lineRule="auto" w:line="276" w:before="0" w:after="200"/>
       <w:jc w:val="left"/>
@@ -1813,6 +1933,7 @@
     <w:rsid w:val="00fc693f"/>
     <w:pPr>
       <w:widowControl/>
+      <w:suppressAutoHyphens w:val="true"/>
       <w:bidi w:val="0"/>
       <w:spacing w:lineRule="auto" w:line="240" w:before="0" w:after="0"/>
       <w:jc w:val="left"/>
@@ -1911,24 +2032,29 @@
       <w:szCs w:val="16"/>
     </w:rPr>
   </w:style>
-  <w:style w:type="paragraph" w:styleId="List2">
+  <w:style w:type="paragraph" w:styleId="ListBullet3">
     <w:name w:val="List Bullet 3"/>
     <w:basedOn w:val="Normal"/>
     <w:uiPriority w:val="99"/>
     <w:unhideWhenUsed/>
+    <w:qFormat/>
     <w:rsid w:val="00326f90"/>
     <w:pPr>
+      <w:numPr>
+        <w:ilvl w:val="0"/>
+        <w:numId w:val="3"/>
+      </w:numPr>
       <w:spacing w:before="0" w:after="200"/>
-      <w:ind w:left="720" w:hanging="360"/>
       <w:contextualSpacing/>
     </w:pPr>
     <w:rPr/>
   </w:style>
-  <w:style w:type="paragraph" w:styleId="List3">
+  <w:style w:type="paragraph" w:styleId="ListBullet4">
     <w:name w:val="List Bullet 4"/>
     <w:basedOn w:val="Normal"/>
     <w:uiPriority w:val="99"/>
     <w:unhideWhenUsed/>
+    <w:qFormat/>
     <w:rsid w:val="00326f90"/>
     <w:pPr>
       <w:spacing w:before="0" w:after="200"/>
@@ -1965,23 +2091,6 @@
       <w:numPr>
         <w:ilvl w:val="0"/>
         <w:numId w:val="2"/>
-      </w:numPr>
-      <w:spacing w:before="0" w:after="200"/>
-      <w:contextualSpacing/>
-    </w:pPr>
-    <w:rPr/>
-  </w:style>
-  <w:style w:type="paragraph" w:styleId="ListBullet3">
-    <w:name w:val="List Bullet 3"/>
-    <w:basedOn w:val="Normal"/>
-    <w:uiPriority w:val="99"/>
-    <w:unhideWhenUsed/>
-    <w:qFormat/>
-    <w:rsid w:val="00326f90"/>
-    <w:pPr>
-      <w:numPr>
-        <w:ilvl w:val="0"/>
-        <w:numId w:val="3"/>
       </w:numPr>
       <w:spacing w:before="0" w:after="200"/>
       <w:contextualSpacing/>
@@ -2100,6 +2209,7 @@
         <w:tab w:val="left" w:pos="3456" w:leader="none"/>
         <w:tab w:val="left" w:pos="4032" w:leader="none"/>
       </w:tabs>
+      <w:suppressAutoHyphens w:val="true"/>
       <w:bidi w:val="0"/>
       <w:spacing w:lineRule="auto" w:line="276" w:before="0" w:after="200"/>
       <w:jc w:val="left"/>

</xml_diff>